<commit_message>
Simplify task 1 script and inputs
</commit_message>
<xml_diff>
--- a/task1-bzie0068-covenant-test/upload/inputs/Credit_Memo_Template.docx
+++ b/task1-bzie0068-covenant-test/upload/inputs/Credit_Memo_Template.docx
@@ -52,198 +52,6 @@
         <w:pStyle w:val="ListBullet"/>
       </w:pPr>
     </w:p>
-    <w:p>
-      <w:pPr>
-        <w:pStyle w:val="Heading2"/>
-      </w:pPr>
-      <w:r>
-        <w:t>Covenant Results</w:t>
-      </w:r>
-    </w:p>
-    <w:tbl>
-      <w:tblPr>
-        <w:tblStyle w:val="TableGrid"/>
-        <w:tblW w:type="auto" w:w="0"/>
-        <w:tblLook w:firstColumn="1" w:firstRow="1" w:lastColumn="0" w:lastRow="0" w:noHBand="0" w:noVBand="1" w:val="04A0"/>
-      </w:tblPr>
-      <w:tblGrid>
-        <w:gridCol w:w="1728"/>
-        <w:gridCol w:w="1728"/>
-        <w:gridCol w:w="1728"/>
-        <w:gridCol w:w="1728"/>
-        <w:gridCol w:w="1728"/>
-      </w:tblGrid>
-      <w:tr>
-        <w:tc>
-          <w:tcPr>
-            <w:tcW w:type="dxa" w:w="1728"/>
-          </w:tcPr>
-          <w:p>
-            <w:r/>
-          </w:p>
-        </w:tc>
-        <w:tc>
-          <w:tcPr>
-            <w:tcW w:type="dxa" w:w="1728"/>
-          </w:tcPr>
-          <w:p>
-            <w:r>
-              <w:t>Borrower</w:t>
-            </w:r>
-          </w:p>
-        </w:tc>
-        <w:tc>
-          <w:tcPr>
-            <w:tcW w:type="dxa" w:w="1728"/>
-          </w:tcPr>
-          <w:p>
-            <w:r>
-              <w:t>My recalculation</w:t>
-            </w:r>
-          </w:p>
-        </w:tc>
-        <w:tc>
-          <w:tcPr>
-            <w:tcW w:type="dxa" w:w="1728"/>
-          </w:tcPr>
-          <w:p>
-            <w:r>
-              <w:t>Required</w:t>
-            </w:r>
-          </w:p>
-        </w:tc>
-        <w:tc>
-          <w:tcPr>
-            <w:tcW w:type="dxa" w:w="1728"/>
-          </w:tcPr>
-          <w:p>
-            <w:r>
-              <w:t>Result</w:t>
-            </w:r>
-          </w:p>
-        </w:tc>
-      </w:tr>
-      <w:tr>
-        <w:tc>
-          <w:tcPr>
-            <w:tcW w:type="dxa" w:w="1728"/>
-          </w:tcPr>
-          <w:p>
-            <w:r>
-              <w:t>Consolidated EBITDA ($mm)</w:t>
-            </w:r>
-          </w:p>
-        </w:tc>
-        <w:tc>
-          <w:tcPr>
-            <w:tcW w:type="dxa" w:w="1728"/>
-          </w:tcPr>
-          <w:p/>
-        </w:tc>
-        <w:tc>
-          <w:tcPr>
-            <w:tcW w:type="dxa" w:w="1728"/>
-          </w:tcPr>
-          <w:p/>
-        </w:tc>
-        <w:tc>
-          <w:tcPr>
-            <w:tcW w:type="dxa" w:w="1728"/>
-          </w:tcPr>
-          <w:p>
-            <w:r>
-              <w:t>n/a</w:t>
-            </w:r>
-          </w:p>
-        </w:tc>
-        <w:tc>
-          <w:tcPr>
-            <w:tcW w:type="dxa" w:w="1728"/>
-          </w:tcPr>
-          <w:p/>
-        </w:tc>
-      </w:tr>
-      <w:tr>
-        <w:tc>
-          <w:tcPr>
-            <w:tcW w:type="dxa" w:w="1728"/>
-          </w:tcPr>
-          <w:p>
-            <w:r>
-              <w:t>Total Net Leverage</w:t>
-            </w:r>
-          </w:p>
-        </w:tc>
-        <w:tc>
-          <w:tcPr>
-            <w:tcW w:type="dxa" w:w="1728"/>
-          </w:tcPr>
-          <w:p/>
-        </w:tc>
-        <w:tc>
-          <w:tcPr>
-            <w:tcW w:type="dxa" w:w="1728"/>
-          </w:tcPr>
-          <w:p/>
-        </w:tc>
-        <w:tc>
-          <w:tcPr>
-            <w:tcW w:type="dxa" w:w="1728"/>
-          </w:tcPr>
-          <w:p>
-            <w:r>
-              <w:t>≤ 5.25x</w:t>
-            </w:r>
-          </w:p>
-        </w:tc>
-        <w:tc>
-          <w:tcPr>
-            <w:tcW w:type="dxa" w:w="1728"/>
-          </w:tcPr>
-          <w:p/>
-        </w:tc>
-      </w:tr>
-      <w:tr>
-        <w:tc>
-          <w:tcPr>
-            <w:tcW w:type="dxa" w:w="1728"/>
-          </w:tcPr>
-          <w:p>
-            <w:r>
-              <w:t>Interest Coverage</w:t>
-            </w:r>
-          </w:p>
-        </w:tc>
-        <w:tc>
-          <w:tcPr>
-            <w:tcW w:type="dxa" w:w="1728"/>
-          </w:tcPr>
-          <w:p/>
-        </w:tc>
-        <w:tc>
-          <w:tcPr>
-            <w:tcW w:type="dxa" w:w="1728"/>
-          </w:tcPr>
-          <w:p/>
-        </w:tc>
-        <w:tc>
-          <w:tcPr>
-            <w:tcW w:type="dxa" w:w="1728"/>
-          </w:tcPr>
-          <w:p>
-            <w:r>
-              <w:t>≥ 2.25x</w:t>
-            </w:r>
-          </w:p>
-        </w:tc>
-        <w:tc>
-          <w:tcPr>
-            <w:tcW w:type="dxa" w:w="1728"/>
-          </w:tcPr>
-          <w:p/>
-        </w:tc>
-      </w:tr>
-    </w:tbl>
     <w:p>
       <w:pPr>
         <w:pStyle w:val="Heading2"/>

</xml_diff>